<commit_message>
Footer, errorpaginas en formulier afgestemd op privacy.
403/404 uit site-template; dynamisch copyright; kennismakingsformulier met toestemming en gezag-tekst; privacy minderjarigen aangevuld.

Co-authored-by: Cursor <cursoragent@cursor.com>
</commit_message>
<xml_diff>
--- a/assets/docs/Kennismakingsformulier-NEI-coaching-en-therapie.docx
+++ b/assets/docs/Kennismakingsformulier-NEI-coaching-en-therapie.docx
@@ -1249,6 +1249,302 @@
       <w:cols w:space="708"/>
       <w:docGrid w:linePitch="360"/>
     </w:sectPr>
+    <w:p>
+      <w:pPr>
+        <w:pStyle w:val="Plattetekst"/>
+      </w:pPr>
+      <w:r>
+        <w:rPr>
+          <w:rFonts w:ascii="Tahoma" w:hAnsi="Tahoma" w:cs="Tahoma"/>
+          <w:szCs w:val="22"/>
+        </w:rPr>
+        <w:t xml:space="preserve"/>
+      </w:r>
+    </w:p>
+    <w:p>
+      <w:pPr>
+        <w:pStyle w:val="Plattetekst"/>
+      </w:pPr>
+      <w:r>
+        <w:rPr>
+          <w:rFonts w:ascii="Tahoma" w:hAnsi="Tahoma" w:cs="Tahoma"/>
+          <w:b/>
+          <w:szCs w:val="22"/>
+        </w:rPr>
+        <w:t xml:space="preserve">Toestemming verwerking persoonsgegevens</w:t>
+      </w:r>
+    </w:p>
+    <w:p>
+      <w:pPr>
+        <w:pStyle w:val="Plattetekst"/>
+      </w:pPr>
+      <w:r>
+        <w:rPr>
+          <w:rFonts w:ascii="Tahoma" w:hAnsi="Tahoma" w:cs="Tahoma"/>
+          <w:szCs w:val="22"/>
+        </w:rPr>
+        <w:t xml:space="preserve">Ik geef toestemming aan Praktijk Annemieke om mijn (bijzondere) persoonsgegevens te verwerken voor het uitvoeren van de behandeling en de daarmee samenhangende administratie, zoals beschreven in de privacyverklaring op praktijkannemieke.nl.</w:t>
+      </w:r>
+    </w:p>
+    <w:p>
+      <w:pPr>
+        <w:pStyle w:val="Plattetekst"/>
+      </w:pPr>
+      <w:r>
+        <w:rPr>
+          <w:rFonts w:ascii="Tahoma" w:hAnsi="Tahoma" w:cs="Tahoma"/>
+          <w:szCs w:val="22"/>
+        </w:rPr>
+        <w:t xml:space="preserve"/>
+      </w:r>
+    </w:p>
+    <w:p>
+      <w:pPr>
+        <w:pStyle w:val="Plattetekst"/>
+      </w:pPr>
+      <w:r>
+        <w:rPr>
+          <w:rFonts w:ascii="Tahoma" w:hAnsi="Tahoma" w:cs="Tahoma"/>
+          <w:szCs w:val="22"/>
+        </w:rPr>
+        <w:t xml:space="preserve">Datum: ........................................          Handtekening: ........................................</w:t>
+      </w:r>
+    </w:p>
+    <w:p>
+      <w:pPr>
+        <w:pStyle w:val="Plattetekst"/>
+      </w:pPr>
+      <w:r>
+        <w:rPr>
+          <w:rFonts w:ascii="Tahoma" w:hAnsi="Tahoma" w:cs="Tahoma"/>
+          <w:szCs w:val="22"/>
+        </w:rPr>
+        <w:t xml:space="preserve"/>
+      </w:r>
+    </w:p>
+    <w:p>
+      <w:pPr>
+        <w:pStyle w:val="Plattetekst"/>
+      </w:pPr>
+      <w:r>
+        <w:rPr>
+          <w:rFonts w:ascii="Tahoma" w:hAnsi="Tahoma" w:cs="Tahoma"/>
+          <w:b/>
+          <w:szCs w:val="22"/>
+        </w:rPr>
+        <w:t xml:space="preserve">Alleen invullen bij minderjarige cliënt (jonger dan 16 jaar)</w:t>
+      </w:r>
+    </w:p>
+    <w:p>
+      <w:pPr>
+        <w:pStyle w:val="Plattetekst"/>
+      </w:pPr>
+      <w:r>
+        <w:rPr>
+          <w:rFonts w:ascii="Tahoma" w:hAnsi="Tahoma" w:cs="Tahoma"/>
+          <w:szCs w:val="22"/>
+        </w:rPr>
+        <w:t xml:space="preserve">Laat dit gedeelte leeg als de cliënt 16 jaar of ouder is.</w:t>
+      </w:r>
+    </w:p>
+    <w:p>
+      <w:pPr>
+        <w:pStyle w:val="Plattetekst"/>
+      </w:pPr>
+      <w:r>
+        <w:rPr>
+          <w:rFonts w:ascii="Tahoma" w:hAnsi="Tahoma" w:cs="Tahoma"/>
+          <w:b/>
+          <w:szCs w:val="22"/>
+        </w:rPr>
+        <w:t xml:space="preserve">Naam minderjarige:</w:t>
+      </w:r>
+    </w:p>
+    <w:p>
+      <w:pPr>
+        <w:pStyle w:val="Plattetekst"/>
+      </w:pPr>
+      <w:r>
+        <w:rPr>
+          <w:rFonts w:ascii="Tahoma" w:hAnsi="Tahoma" w:cs="Tahoma"/>
+          <w:szCs w:val="22"/>
+        </w:rPr>
+        <w:t xml:space="preserve"/>
+      </w:r>
+    </w:p>
+    <w:p>
+      <w:pPr>
+        <w:pStyle w:val="Plattetekst"/>
+      </w:pPr>
+      <w:r>
+        <w:rPr>
+          <w:rFonts w:ascii="Tahoma" w:hAnsi="Tahoma" w:cs="Tahoma"/>
+          <w:b/>
+          <w:szCs w:val="22"/>
+        </w:rPr>
+        <w:t xml:space="preserve">Geboortedatum minderjarige:</w:t>
+      </w:r>
+    </w:p>
+    <w:p>
+      <w:pPr>
+        <w:pStyle w:val="Plattetekst"/>
+      </w:pPr>
+      <w:r>
+        <w:rPr>
+          <w:rFonts w:ascii="Tahoma" w:hAnsi="Tahoma" w:cs="Tahoma"/>
+          <w:szCs w:val="22"/>
+        </w:rPr>
+        <w:t xml:space="preserve"/>
+      </w:r>
+    </w:p>
+    <w:p>
+      <w:pPr>
+        <w:pStyle w:val="Plattetekst"/>
+      </w:pPr>
+      <w:r>
+        <w:rPr>
+          <w:rFonts w:ascii="Tahoma" w:hAnsi="Tahoma" w:cs="Tahoma"/>
+          <w:b/>
+          <w:szCs w:val="22"/>
+        </w:rPr>
+        <w:t xml:space="preserve">Ouder/voogd 1</w:t>
+      </w:r>
+    </w:p>
+    <w:p>
+      <w:pPr>
+        <w:pStyle w:val="Plattetekst"/>
+      </w:pPr>
+      <w:r>
+        <w:rPr>
+          <w:rFonts w:ascii="Tahoma" w:hAnsi="Tahoma" w:cs="Tahoma"/>
+          <w:b/>
+          <w:szCs w:val="22"/>
+        </w:rPr>
+        <w:t xml:space="preserve">Naam:</w:t>
+      </w:r>
+    </w:p>
+    <w:p>
+      <w:pPr>
+        <w:pStyle w:val="Plattetekst"/>
+      </w:pPr>
+      <w:r>
+        <w:rPr>
+          <w:rFonts w:ascii="Tahoma" w:hAnsi="Tahoma" w:cs="Tahoma"/>
+          <w:szCs w:val="22"/>
+        </w:rPr>
+        <w:t xml:space="preserve"/>
+      </w:r>
+    </w:p>
+    <w:p>
+      <w:pPr>
+        <w:pStyle w:val="Plattetekst"/>
+      </w:pPr>
+      <w:r>
+        <w:rPr>
+          <w:rFonts w:ascii="Tahoma" w:hAnsi="Tahoma" w:cs="Tahoma"/>
+          <w:szCs w:val="22"/>
+        </w:rPr>
+        <w:t xml:space="preserve">Datum: ........................................          Handtekening: ........................................</w:t>
+      </w:r>
+    </w:p>
+    <w:p>
+      <w:pPr>
+        <w:pStyle w:val="Plattetekst"/>
+      </w:pPr>
+      <w:r>
+        <w:rPr>
+          <w:rFonts w:ascii="Tahoma" w:hAnsi="Tahoma" w:cs="Tahoma"/>
+          <w:b/>
+          <w:szCs w:val="22"/>
+        </w:rPr>
+        <w:t xml:space="preserve">Ouder/voogd 2 (indien van toepassing)</w:t>
+      </w:r>
+    </w:p>
+    <w:p>
+      <w:pPr>
+        <w:pStyle w:val="Plattetekst"/>
+      </w:pPr>
+      <w:r>
+        <w:rPr>
+          <w:rFonts w:ascii="Tahoma" w:hAnsi="Tahoma" w:cs="Tahoma"/>
+          <w:b/>
+          <w:szCs w:val="22"/>
+        </w:rPr>
+        <w:t xml:space="preserve">Naam:</w:t>
+      </w:r>
+    </w:p>
+    <w:p>
+      <w:pPr>
+        <w:pStyle w:val="Plattetekst"/>
+      </w:pPr>
+      <w:r>
+        <w:rPr>
+          <w:rFonts w:ascii="Tahoma" w:hAnsi="Tahoma" w:cs="Tahoma"/>
+          <w:szCs w:val="22"/>
+        </w:rPr>
+        <w:t xml:space="preserve"/>
+      </w:r>
+    </w:p>
+    <w:p>
+      <w:pPr>
+        <w:pStyle w:val="Plattetekst"/>
+      </w:pPr>
+      <w:r>
+        <w:rPr>
+          <w:rFonts w:ascii="Tahoma" w:hAnsi="Tahoma" w:cs="Tahoma"/>
+          <w:szCs w:val="22"/>
+        </w:rPr>
+        <w:t xml:space="preserve">Datum: ........................................          Handtekening: ........................................</w:t>
+      </w:r>
+    </w:p>
+    <w:p>
+      <w:pPr>
+        <w:pStyle w:val="Plattetekst"/>
+      </w:pPr>
+      <w:r>
+        <w:rPr>
+          <w:rFonts w:ascii="Tahoma" w:hAnsi="Tahoma" w:cs="Tahoma"/>
+          <w:szCs w:val="22"/>
+        </w:rPr>
+        <w:t xml:space="preserve">☐  Ik heb als enige het ouderlijk gezag over de minderjarige cliënt (vul dan ouder/voogd 2 niet in).</w:t>
+      </w:r>
+    </w:p>
+    <w:p>
+      <w:pPr>
+        <w:pStyle w:val="Plattetekst"/>
+      </w:pPr>
+      <w:r>
+        <w:rPr>
+          <w:rFonts w:ascii="Tahoma" w:hAnsi="Tahoma" w:cs="Tahoma"/>
+          <w:szCs w:val="22"/>
+        </w:rPr>
+        <w:t xml:space="preserve">Bij gescheiden ouders met gezamenlijk gezag geven beide ouders toestemming.</w:t>
+      </w:r>
+    </w:p>
+    <w:p>
+      <w:pPr>
+        <w:pStyle w:val="Plattetekst"/>
+      </w:pPr>
+      <w:r>
+        <w:rPr>
+          <w:rFonts w:ascii="Tahoma" w:hAnsi="Tahoma" w:cs="Tahoma"/>
+          <w:szCs w:val="22"/>
+        </w:rPr>
+        <w:t xml:space="preserve">De toestemming van de andere ouder kan ook schriftelijk of per e-mail worden gegeven.</w:t>
+      </w:r>
+    </w:p>
+    <w:p>
+      <w:pPr>
+        <w:pStyle w:val="Plattetekst"/>
+      </w:pPr>
+      <w:r>
+        <w:rPr>
+          <w:rFonts w:ascii="Tahoma" w:hAnsi="Tahoma" w:cs="Tahoma"/>
+          <w:szCs w:val="22"/>
+        </w:rPr>
+        <w:t xml:space="preserve">Heeft één ouder het gezag alleen, dan volstaat diens toestemming.</w:t>
+      </w:r>
+    </w:p>
   </w:body>
 </w:document>
 </file>

</xml_diff>

<commit_message>
Hero en footer verfijnen; mobiel gecentreerd; formulier gezagtekst.
Co-authored-by: Cursor <cursoragent@cursor.com>
</commit_message>
<xml_diff>
--- a/assets/docs/Kennismakingsformulier-NEI-coaching-en-therapie.docx
+++ b/assets/docs/Kennismakingsformulier-NEI-coaching-en-therapie.docx
@@ -1268,10 +1268,9 @@
       <w:r>
         <w:rPr>
           <w:rFonts w:ascii="Tahoma" w:hAnsi="Tahoma" w:cs="Tahoma"/>
-          <w:b/>
-          <w:szCs w:val="22"/>
-        </w:rPr>
-        <w:t xml:space="preserve">Toestemming verwerking persoonsgegevens</w:t>
+          <w:szCs w:val="22"/>
+        </w:rPr>
+        <w:t xml:space="preserve">Bij gescheiden ouders met gezamenlijk gezag geven beide ouders toestemming.</w:t>
       </w:r>
     </w:p>
     <w:p>
@@ -1283,7 +1282,7 @@
           <w:rFonts w:ascii="Tahoma" w:hAnsi="Tahoma" w:cs="Tahoma"/>
           <w:szCs w:val="22"/>
         </w:rPr>
-        <w:t xml:space="preserve">Ik geef toestemming aan Praktijk Annemieke om mijn (bijzondere) persoonsgegevens te verwerken voor het uitvoeren van de behandeling en de daarmee samenhangende administratie, zoals beschreven in de privacyverklaring op praktijkannemieke.nl.</w:t>
+        <w:t xml:space="preserve">De toestemming van de andere ouder kan ook schriftelijk of per e-mail worden gegeven.</w:t>
       </w:r>
     </w:p>
     <w:p>
@@ -1295,6 +1294,18 @@
           <w:rFonts w:ascii="Tahoma" w:hAnsi="Tahoma" w:cs="Tahoma"/>
           <w:szCs w:val="22"/>
         </w:rPr>
+        <w:t xml:space="preserve">Heeft één ouder het gezag alleen, dan volstaat diens toestemming.</w:t>
+      </w:r>
+    </w:p>
+    <w:p>
+      <w:pPr>
+        <w:pStyle w:val="Plattetekst"/>
+      </w:pPr>
+      <w:r>
+        <w:rPr>
+          <w:rFonts w:ascii="Tahoma" w:hAnsi="Tahoma" w:cs="Tahoma"/>
+          <w:szCs w:val="22"/>
+        </w:rPr>
         <w:t xml:space="preserve"/>
       </w:r>
     </w:p>
@@ -1507,42 +1518,6 @@
           <w:szCs w:val="22"/>
         </w:rPr>
         <w:t xml:space="preserve">☐  Ik heb als enige het ouderlijk gezag over de minderjarige cliënt (vul dan ouder/voogd 2 niet in).</w:t>
-      </w:r>
-    </w:p>
-    <w:p>
-      <w:pPr>
-        <w:pStyle w:val="Plattetekst"/>
-      </w:pPr>
-      <w:r>
-        <w:rPr>
-          <w:rFonts w:ascii="Tahoma" w:hAnsi="Tahoma" w:cs="Tahoma"/>
-          <w:szCs w:val="22"/>
-        </w:rPr>
-        <w:t xml:space="preserve">Bij gescheiden ouders met gezamenlijk gezag geven beide ouders toestemming.</w:t>
-      </w:r>
-    </w:p>
-    <w:p>
-      <w:pPr>
-        <w:pStyle w:val="Plattetekst"/>
-      </w:pPr>
-      <w:r>
-        <w:rPr>
-          <w:rFonts w:ascii="Tahoma" w:hAnsi="Tahoma" w:cs="Tahoma"/>
-          <w:szCs w:val="22"/>
-        </w:rPr>
-        <w:t xml:space="preserve">De toestemming van de andere ouder kan ook schriftelijk of per e-mail worden gegeven.</w:t>
-      </w:r>
-    </w:p>
-    <w:p>
-      <w:pPr>
-        <w:pStyle w:val="Plattetekst"/>
-      </w:pPr>
-      <w:r>
-        <w:rPr>
-          <w:rFonts w:ascii="Tahoma" w:hAnsi="Tahoma" w:cs="Tahoma"/>
-          <w:szCs w:val="22"/>
-        </w:rPr>
-        <w:t xml:space="preserve">Heeft één ouder het gezag alleen, dan volstaat diens toestemming.</w:t>
       </w:r>
     </w:p>
   </w:body>

</xml_diff>

<commit_message>
Kennismakingsformulier: witregel vóór datum/handtekening.
Co-authored-by: Cursor <cursoragent@cursor.com>
</commit_message>
<xml_diff>
--- a/assets/docs/Kennismakingsformulier-NEI-coaching-en-therapie.docx
+++ b/assets/docs/Kennismakingsformulier-NEI-coaching-en-therapie.docx
@@ -1318,6 +1318,18 @@
           <w:rFonts w:ascii="Tahoma" w:hAnsi="Tahoma" w:cs="Tahoma"/>
           <w:szCs w:val="22"/>
         </w:rPr>
+        <w:t xml:space="preserve"/>
+      </w:r>
+    </w:p>
+    <w:p>
+      <w:pPr>
+        <w:pStyle w:val="Plattetekst"/>
+      </w:pPr>
+      <w:r>
+        <w:rPr>
+          <w:rFonts w:ascii="Tahoma" w:hAnsi="Tahoma" w:cs="Tahoma"/>
+          <w:szCs w:val="22"/>
+        </w:rPr>
         <w:t xml:space="preserve">Datum: ........................................          Handtekening: ........................................</w:t>
       </w:r>
     </w:p>

</xml_diff>

<commit_message>
Footer-social roze na Divi-CSS; submenu verticaal; formulier witregel ouder 2.
Co-authored-by: Cursor <cursoragent@cursor.com>
</commit_message>
<xml_diff>
--- a/assets/docs/Kennismakingsformulier-NEI-coaching-en-therapie.docx
+++ b/assets/docs/Kennismakingsformulier-NEI-coaching-en-therapie.docx
@@ -1468,6 +1468,18 @@
           <w:szCs w:val="22"/>
         </w:rPr>
         <w:t xml:space="preserve">Datum: ........................................          Handtekening: ........................................</w:t>
+      </w:r>
+    </w:p>
+    <w:p>
+      <w:pPr>
+        <w:pStyle w:val="Plattetekst"/>
+      </w:pPr>
+      <w:r>
+        <w:rPr>
+          <w:rFonts w:ascii="Tahoma" w:hAnsi="Tahoma" w:cs="Tahoma"/>
+          <w:szCs w:val="22"/>
+        </w:rPr>
+        <w:t xml:space="preserve"/>
       </w:r>
     </w:p>
     <w:p>

</xml_diff>